<commit_message>
Initial commit - Motowarehouse ACS Payments
</commit_message>
<xml_diff>
--- a/ACS_Portal_User_Manual.docx
+++ b/ACS_Portal_User_Manual.docx
@@ -139,7 +139,7 @@
           <w:sz w:val="18"/>
           <w:szCs w:val="18"/>
         </w:rPr>
-        <w:t xml:space="preserve">Version 1.1  ·  July 2026</w:t>
+        <w:t xml:space="preserve">Version 1.2  ·  July 2026</w:t>
       </w:r>
     </w:p>
     <w:p>
@@ -435,7 +435,7 @@
                 <w:sz w:val="19"/>
                 <w:szCs w:val="19"/>
               </w:rPr>
-              <w:t xml:space="preserve">The daily "ΑΝΑΖΗΤΗΣΗ ΑΠΟΣΤΟΛΩΝ" Excel export from ACS</w:t>
+              <w:t xml:space="preserve">The month-to-date "ΑΝΑΖΗΤΗΣΗ ΑΠΟΣΤΟΛΩΝ" export (1st of the month to today)</w:t>
             </w:r>
           </w:p>
         </w:tc>
@@ -529,7 +529,7 @@
                 <w:sz w:val="19"/>
                 <w:szCs w:val="19"/>
               </w:rPr>
-              <w:t xml:space="preserve">The ACS "Notification of Payment" file</w:t>
+              <w:t xml:space="preserve">The ACS "Notification of Payment" file, as ACS sends it</w:t>
             </w:r>
           </w:p>
         </w:tc>
@@ -993,7 +993,7 @@
                 <w:sz w:val="19"/>
                 <w:szCs w:val="19"/>
               </w:rPr>
-              <w:t xml:space="preserve">You have imported today’s shipment file (File 1).</w:t>
+              <w:t xml:space="preserve">You have imported the shipment file today.</w:t>
             </w:r>
           </w:p>
         </w:tc>
@@ -1055,7 +1055,7 @@
                 <w:sz w:val="19"/>
                 <w:szCs w:val="19"/>
               </w:rPr>
-              <w:t xml:space="preserve">You have imported today’s payment file (File 2).</w:t>
+              <w:t xml:space="preserve">You have imported a payment file today.</w:t>
             </w:r>
           </w:p>
         </w:tc>
@@ -1234,203 +1234,6 @@
           <w:rFonts w:ascii="Lato" w:cs="Lato" w:eastAsia="Lato" w:hAnsi="Lato"/>
         </w:rPr>
         <w:t xml:space="preserve">4. Step one — import the shipment file (File 1)</w:t>
-      </w:r>
-    </w:p>
-    <w:p>
-      <w:pPr>
-        <w:pStyle w:val="ListParagraph"/>
-        <w:numPr>
-          <w:ilvl w:val="0"/>
-          <w:numId w:val="3"/>
-        </w:numPr>
-        <w:spacing w:after="100" w:line="276"/>
-      </w:pPr>
-      <w:r>
-        <w:rPr>
-          <w:rFonts w:ascii="Lato" w:cs="Lato" w:eastAsia="Lato" w:hAnsi="Lato"/>
-        </w:rPr>
-        <w:t xml:space="preserve">Click Import in the left menu.</w:t>
-      </w:r>
-    </w:p>
-    <w:p>
-      <w:pPr>
-        <w:pStyle w:val="ListParagraph"/>
-        <w:numPr>
-          <w:ilvl w:val="0"/>
-          <w:numId w:val="3"/>
-        </w:numPr>
-        <w:spacing w:after="100" w:line="276"/>
-      </w:pPr>
-      <w:r>
-        <w:rPr>
-          <w:rFonts w:ascii="Lato" w:cs="Lato" w:eastAsia="Lato" w:hAnsi="Lato"/>
-        </w:rPr>
-        <w:t xml:space="preserve">In the </w:t>
-      </w:r>
-      <w:r>
-        <w:rPr>
-          <w:rFonts w:ascii="Lato" w:cs="Lato" w:eastAsia="Lato" w:hAnsi="Lato"/>
-          <w:b/>
-          <w:bCs/>
-        </w:rPr>
-        <w:t xml:space="preserve">“File 1 — Shipments”</w:t>
-      </w:r>
-      <w:r>
-        <w:rPr>
-          <w:rFonts w:ascii="Lato" w:cs="Lato" w:eastAsia="Lato" w:hAnsi="Lato"/>
-        </w:rPr>
-        <w:t xml:space="preserve"> box, either drag the Excel file onto it or click to browse and select it.</w:t>
-      </w:r>
-    </w:p>
-    <w:p>
-      <w:pPr>
-        <w:pStyle w:val="ListParagraph"/>
-        <w:numPr>
-          <w:ilvl w:val="0"/>
-          <w:numId w:val="3"/>
-        </w:numPr>
-        <w:spacing w:after="100" w:line="276"/>
-      </w:pPr>
-      <w:r>
-        <w:rPr>
-          <w:rFonts w:ascii="Lato" w:cs="Lato" w:eastAsia="Lato" w:hAnsi="Lato"/>
-        </w:rPr>
-        <w:t xml:space="preserve">Wait for the summary. It shows how many rows were processed, how many were new or updated, outbound vs inbound, and the total COD to collect.</w:t>
-      </w:r>
-    </w:p>
-    <w:p>
-      <w:pPr>
-        <w:pStyle w:val="ListParagraph"/>
-        <w:numPr>
-          <w:ilvl w:val="0"/>
-          <w:numId w:val="3"/>
-        </w:numPr>
-        <w:spacing w:after="100" w:line="276"/>
-      </w:pPr>
-      <w:r>
-        <w:rPr>
-          <w:rFonts w:ascii="Lato" w:cs="Lato" w:eastAsia="Lato" w:hAnsi="Lato"/>
-        </w:rPr>
-        <w:t xml:space="preserve">If any duplicate tracking numbers were found, an amber note lists them. They are flagged on the Exceptions page.</w:t>
-      </w:r>
-    </w:p>
-    <w:p>
-      <w:pPr>
-        <w:pStyle w:val="Heading2"/>
-        <w:spacing w:after="120" w:before="240"/>
-      </w:pPr>
-      <w:r>
-        <w:rPr>
-          <w:rFonts w:ascii="Lato" w:cs="Lato" w:eastAsia="Lato" w:hAnsi="Lato"/>
-        </w:rPr>
-        <w:t xml:space="preserve">What the portal does automatically</w:t>
-      </w:r>
-    </w:p>
-    <w:p>
-      <w:pPr>
-        <w:pStyle w:val="ListParagraph"/>
-        <w:numPr>
-          <w:ilvl w:val="0"/>
-          <w:numId w:val="4"/>
-        </w:numPr>
-        <w:spacing w:after="80" w:line="268"/>
-      </w:pPr>
-      <w:r>
-        <w:rPr>
-          <w:rFonts w:ascii="Lato" w:cs="Lato" w:eastAsia="Lato" w:hAnsi="Lato"/>
-          <w:b/>
-          <w:bCs/>
-        </w:rPr>
-        <w:t xml:space="preserve">Direction: </w:t>
-      </w:r>
-      <w:r>
-        <w:rPr>
-          <w:rFonts w:ascii="Lato" w:cs="Lato" w:eastAsia="Lato" w:hAnsi="Lato"/>
-        </w:rPr>
-        <w:t xml:space="preserve">each parcel is marked </w:t>
-      </w:r>
-      <w:r>
-        <w:rPr>
-          <w:rFonts w:ascii="Lato" w:cs="Lato" w:eastAsia="Lato" w:hAnsi="Lato"/>
-          <w:b/>
-          <w:bCs/>
-          <w:color w:val="009BB4"/>
-          <w:sz w:val="19"/>
-          <w:szCs w:val="19"/>
-        </w:rPr>
-        <w:t xml:space="preserve">Outbound</w:t>
-      </w:r>
-      <w:r>
-        <w:rPr>
-          <w:rFonts w:ascii="Lato" w:cs="Lato" w:eastAsia="Lato" w:hAnsi="Lato"/>
-        </w:rPr>
-        <w:t xml:space="preserve"> (going to a client, who owes the COD) or </w:t>
-      </w:r>
-      <w:r>
-        <w:rPr>
-          <w:rFonts w:ascii="Lato" w:cs="Lato" w:eastAsia="Lato" w:hAnsi="Lato"/>
-          <w:b/>
-          <w:bCs/>
-          <w:color w:val="5B666D"/>
-          <w:sz w:val="19"/>
-          <w:szCs w:val="19"/>
-        </w:rPr>
-        <w:t xml:space="preserve">Inbound</w:t>
-      </w:r>
-      <w:r>
-        <w:rPr>
-          <w:rFonts w:ascii="Lato" w:cs="Lato" w:eastAsia="Lato" w:hAnsi="Lato"/>
-        </w:rPr>
-        <w:t xml:space="preserve"> (coming to us, informational only).</w:t>
-      </w:r>
-    </w:p>
-    <w:p>
-      <w:pPr>
-        <w:pStyle w:val="ListParagraph"/>
-        <w:numPr>
-          <w:ilvl w:val="0"/>
-          <w:numId w:val="4"/>
-        </w:numPr>
-        <w:spacing w:after="80" w:line="268"/>
-      </w:pPr>
-      <w:r>
-        <w:rPr>
-          <w:rFonts w:ascii="Lato" w:cs="Lato" w:eastAsia="Lato" w:hAnsi="Lato"/>
-        </w:rPr>
-        <w:t xml:space="preserve">COD parcels start as </w:t>
-      </w:r>
-      <w:r>
-        <w:rPr>
-          <w:rFonts w:ascii="Lato" w:cs="Lato" w:eastAsia="Lato" w:hAnsi="Lato"/>
-          <w:b/>
-          <w:bCs/>
-          <w:color w:val="B7791F"/>
-          <w:sz w:val="19"/>
-          <w:szCs w:val="19"/>
-        </w:rPr>
-        <w:t xml:space="preserve">Awaiting</w:t>
-      </w:r>
-      <w:r>
-        <w:rPr>
-          <w:rFonts w:ascii="Lato" w:cs="Lato" w:eastAsia="Lato" w:hAnsi="Lato"/>
-        </w:rPr>
-        <w:t xml:space="preserve">. Parcels with no COD are stored but need no payment.</w:t>
-      </w:r>
-    </w:p>
-    <w:p>
-      <w:pPr>
-        <w:pStyle w:val="ListParagraph"/>
-        <w:numPr>
-          <w:ilvl w:val="0"/>
-          <w:numId w:val="4"/>
-        </w:numPr>
-        <w:spacing w:after="80" w:line="268"/>
-      </w:pPr>
-      <w:r>
-        <w:rPr>
-          <w:rFonts w:ascii="Lato" w:cs="Lato" w:eastAsia="Lato" w:hAnsi="Lato"/>
-        </w:rPr>
-        <w:t xml:space="preserve">Re-importing the same file is safe — existing parcels are updated, not duplicated.</w:t>
       </w:r>
     </w:p>
     <w:tbl>
@@ -1473,6 +1276,315 @@
                 <w:sz w:val="20"/>
                 <w:szCs w:val="20"/>
               </w:rPr>
+              <w:t xml:space="preserve">How the shipment file works — read this once</w:t>
+            </w:r>
+          </w:p>
+          <w:p>
+            <w:pPr>
+              <w:spacing w:after="40"/>
+            </w:pPr>
+            <w:r>
+              <w:rPr>
+                <w:rFonts w:ascii="Lato" w:cs="Lato" w:eastAsia="Lato" w:hAnsi="Lato"/>
+                <w:color w:val="242B2E"/>
+                <w:sz w:val="20"/>
+                <w:szCs w:val="20"/>
+              </w:rPr>
+              <w:t xml:space="preserve">File 1 is a </w:t>
+            </w:r>
+            <w:r>
+              <w:rPr>
+                <w:rFonts w:ascii="Lato" w:cs="Lato" w:eastAsia="Lato" w:hAnsi="Lato"/>
+                <w:b/>
+                <w:bCs/>
+                <w:color w:val="001A21"/>
+                <w:sz w:val="20"/>
+                <w:szCs w:val="20"/>
+              </w:rPr>
+              <w:t xml:space="preserve">month-to-date</w:t>
+            </w:r>
+            <w:r>
+              <w:rPr>
+                <w:rFonts w:ascii="Lato" w:cs="Lato" w:eastAsia="Lato" w:hAnsi="Lato"/>
+                <w:color w:val="242B2E"/>
+                <w:sz w:val="20"/>
+                <w:szCs w:val="20"/>
+              </w:rPr>
+              <w:t xml:space="preserve"> file: it always runs from the </w:t>
+            </w:r>
+            <w:r>
+              <w:rPr>
+                <w:rFonts w:ascii="Lato" w:cs="Lato" w:eastAsia="Lato" w:hAnsi="Lato"/>
+                <w:b/>
+                <w:bCs/>
+                <w:color w:val="001A21"/>
+                <w:sz w:val="20"/>
+                <w:szCs w:val="20"/>
+              </w:rPr>
+              <w:t xml:space="preserve">1st of the month up to today</w:t>
+            </w:r>
+            <w:r>
+              <w:rPr>
+                <w:rFonts w:ascii="Lato" w:cs="Lato" w:eastAsia="Lato" w:hAnsi="Lato"/>
+                <w:color w:val="242B2E"/>
+                <w:sz w:val="20"/>
+                <w:szCs w:val="20"/>
+              </w:rPr>
+              <w:t xml:space="preserve">. Today (say the 9th) you export 1/7 to 9/7. Tomorrow you export 1/7 to 10/7 — the same file, one day longer.</w:t>
+            </w:r>
+          </w:p>
+          <w:p>
+            <w:pPr>
+              <w:spacing w:after="40"/>
+            </w:pPr>
+            <w:r>
+              <w:rPr>
+                <w:rFonts w:ascii="Lato" w:cs="Lato" w:eastAsia="Lato" w:hAnsi="Lato"/>
+                <w:color w:val="242B2E"/>
+                <w:sz w:val="20"/>
+                <w:szCs w:val="20"/>
+              </w:rPr>
+              <w:t xml:space="preserve">Re-uploading is safe and expected: shipments already in the portal are updated with any changes, and tracking numbers that were not there yet are added. Nothing is duplicated, and anything already paid keeps its payments.</w:t>
+            </w:r>
+          </w:p>
+          <w:p>
+            <w:pPr>
+              <w:spacing w:after="40"/>
+            </w:pPr>
+            <w:r>
+              <w:rPr>
+                <w:rFonts w:ascii="Lato" w:cs="Lato" w:eastAsia="Lato" w:hAnsi="Lato"/>
+                <w:color w:val="242B2E"/>
+                <w:sz w:val="20"/>
+                <w:szCs w:val="20"/>
+              </w:rPr>
+              <w:t xml:space="preserve">If you miss a day or two, no problem — just export from the 1st to that day as usual. Missing days simply are not in the file.</w:t>
+            </w:r>
+          </w:p>
+        </w:tc>
+      </w:tr>
+    </w:tbl>
+    <w:p>
+      <w:pPr>
+        <w:pStyle w:val="ListParagraph"/>
+        <w:numPr>
+          <w:ilvl w:val="0"/>
+          <w:numId w:val="3"/>
+        </w:numPr>
+        <w:spacing w:after="100" w:line="276"/>
+      </w:pPr>
+      <w:r>
+        <w:rPr>
+          <w:rFonts w:ascii="Lato" w:cs="Lato" w:eastAsia="Lato" w:hAnsi="Lato"/>
+        </w:rPr>
+        <w:t xml:space="preserve">Click Import in the left menu.</w:t>
+      </w:r>
+    </w:p>
+    <w:p>
+      <w:pPr>
+        <w:pStyle w:val="ListParagraph"/>
+        <w:numPr>
+          <w:ilvl w:val="0"/>
+          <w:numId w:val="3"/>
+        </w:numPr>
+        <w:spacing w:after="100" w:line="276"/>
+      </w:pPr>
+      <w:r>
+        <w:rPr>
+          <w:rFonts w:ascii="Lato" w:cs="Lato" w:eastAsia="Lato" w:hAnsi="Lato"/>
+        </w:rPr>
+        <w:t xml:space="preserve">In the </w:t>
+      </w:r>
+      <w:r>
+        <w:rPr>
+          <w:rFonts w:ascii="Lato" w:cs="Lato" w:eastAsia="Lato" w:hAnsi="Lato"/>
+          <w:b/>
+          <w:bCs/>
+        </w:rPr>
+        <w:t xml:space="preserve">“File 1 — Shipments”</w:t>
+      </w:r>
+      <w:r>
+        <w:rPr>
+          <w:rFonts w:ascii="Lato" w:cs="Lato" w:eastAsia="Lato" w:hAnsi="Lato"/>
+        </w:rPr>
+        <w:t xml:space="preserve"> box, drag the Excel file onto it or click to browse and select it.</w:t>
+      </w:r>
+    </w:p>
+    <w:p>
+      <w:pPr>
+        <w:pStyle w:val="ListParagraph"/>
+        <w:numPr>
+          <w:ilvl w:val="0"/>
+          <w:numId w:val="3"/>
+        </w:numPr>
+        <w:spacing w:after="100" w:line="276"/>
+      </w:pPr>
+      <w:r>
+        <w:rPr>
+          <w:rFonts w:ascii="Lato" w:cs="Lato" w:eastAsia="Lato" w:hAnsi="Lato"/>
+        </w:rPr>
+        <w:t xml:space="preserve">Wait for the summary. It shows how many rows were processed, how many were new vs updated, outbound vs inbound, and the total COD to collect. On a normal day you will see mostly “updated” with a few “new”.</w:t>
+      </w:r>
+    </w:p>
+    <w:p>
+      <w:pPr>
+        <w:pStyle w:val="ListParagraph"/>
+        <w:numPr>
+          <w:ilvl w:val="0"/>
+          <w:numId w:val="3"/>
+        </w:numPr>
+        <w:spacing w:after="100" w:line="276"/>
+      </w:pPr>
+      <w:r>
+        <w:rPr>
+          <w:rFonts w:ascii="Lato" w:cs="Lato" w:eastAsia="Lato" w:hAnsi="Lato"/>
+        </w:rPr>
+        <w:t xml:space="preserve">If any duplicate tracking numbers were found, an amber note lists them. They are flagged on the Exceptions page.</w:t>
+      </w:r>
+    </w:p>
+    <w:p>
+      <w:pPr>
+        <w:pStyle w:val="Heading2"/>
+        <w:spacing w:after="120" w:before="240"/>
+      </w:pPr>
+      <w:r>
+        <w:rPr>
+          <w:rFonts w:ascii="Lato" w:cs="Lato" w:eastAsia="Lato" w:hAnsi="Lato"/>
+        </w:rPr>
+        <w:t xml:space="preserve">What the portal does automatically</w:t>
+      </w:r>
+    </w:p>
+    <w:p>
+      <w:pPr>
+        <w:pStyle w:val="ListParagraph"/>
+        <w:numPr>
+          <w:ilvl w:val="0"/>
+          <w:numId w:val="4"/>
+        </w:numPr>
+        <w:spacing w:after="80" w:line="268"/>
+      </w:pPr>
+      <w:r>
+        <w:rPr>
+          <w:rFonts w:ascii="Lato" w:cs="Lato" w:eastAsia="Lato" w:hAnsi="Lato"/>
+          <w:b/>
+          <w:bCs/>
+        </w:rPr>
+        <w:t xml:space="preserve">Direction: </w:t>
+      </w:r>
+      <w:r>
+        <w:rPr>
+          <w:rFonts w:ascii="Lato" w:cs="Lato" w:eastAsia="Lato" w:hAnsi="Lato"/>
+        </w:rPr>
+        <w:t xml:space="preserve">each parcel is marked </w:t>
+      </w:r>
+      <w:r>
+        <w:rPr>
+          <w:rFonts w:ascii="Lato" w:cs="Lato" w:eastAsia="Lato" w:hAnsi="Lato"/>
+          <w:b/>
+          <w:bCs/>
+          <w:color w:val="009BB4"/>
+          <w:sz w:val="19"/>
+          <w:szCs w:val="19"/>
+        </w:rPr>
+        <w:t xml:space="preserve">Outbound</w:t>
+      </w:r>
+      <w:r>
+        <w:rPr>
+          <w:rFonts w:ascii="Lato" w:cs="Lato" w:eastAsia="Lato" w:hAnsi="Lato"/>
+        </w:rPr>
+        <w:t xml:space="preserve"> (going to a client, who owes the COD) or </w:t>
+      </w:r>
+      <w:r>
+        <w:rPr>
+          <w:rFonts w:ascii="Lato" w:cs="Lato" w:eastAsia="Lato" w:hAnsi="Lato"/>
+          <w:b/>
+          <w:bCs/>
+          <w:color w:val="5B666D"/>
+          <w:sz w:val="19"/>
+          <w:szCs w:val="19"/>
+        </w:rPr>
+        <w:t xml:space="preserve">Inbound</w:t>
+      </w:r>
+      <w:r>
+        <w:rPr>
+          <w:rFonts w:ascii="Lato" w:cs="Lato" w:eastAsia="Lato" w:hAnsi="Lato"/>
+        </w:rPr>
+        <w:t xml:space="preserve"> (coming to us, informational only).</w:t>
+      </w:r>
+    </w:p>
+    <w:p>
+      <w:pPr>
+        <w:pStyle w:val="ListParagraph"/>
+        <w:numPr>
+          <w:ilvl w:val="0"/>
+          <w:numId w:val="4"/>
+        </w:numPr>
+        <w:spacing w:after="80" w:line="268"/>
+      </w:pPr>
+      <w:r>
+        <w:rPr>
+          <w:rFonts w:ascii="Lato" w:cs="Lato" w:eastAsia="Lato" w:hAnsi="Lato"/>
+        </w:rPr>
+        <w:t xml:space="preserve">COD parcels start as </w:t>
+      </w:r>
+      <w:r>
+        <w:rPr>
+          <w:rFonts w:ascii="Lato" w:cs="Lato" w:eastAsia="Lato" w:hAnsi="Lato"/>
+          <w:b/>
+          <w:bCs/>
+          <w:color w:val="B7791F"/>
+          <w:sz w:val="19"/>
+          <w:szCs w:val="19"/>
+        </w:rPr>
+        <w:t xml:space="preserve">Awaiting</w:t>
+      </w:r>
+      <w:r>
+        <w:rPr>
+          <w:rFonts w:ascii="Lato" w:cs="Lato" w:eastAsia="Lato" w:hAnsi="Lato"/>
+        </w:rPr>
+        <w:t xml:space="preserve">. Parcels with no COD are stored but need no payment.</w:t>
+      </w:r>
+    </w:p>
+    <w:tbl>
+      <w:tblPr>
+        <w:tblW w:type="dxa" w:w="9026"/>
+        <w:tblBorders>
+          <w:top w:val="single" w:color="009BB4" w:sz="2"/>
+          <w:left w:val="single" w:color="009BB4" w:sz="12"/>
+          <w:bottom w:val="single" w:color="009BB4" w:sz="2"/>
+          <w:right w:val="single" w:color="009BB4" w:sz="2"/>
+          <w:insideH w:val="single" w:color="auto" w:sz="4"/>
+          <w:insideV w:val="single" w:color="auto" w:sz="4"/>
+        </w:tblBorders>
+      </w:tblPr>
+      <w:tblGrid>
+        <w:gridCol w:w="9026"/>
+      </w:tblGrid>
+      <w:tr>
+        <w:tc>
+          <w:tcPr>
+            <w:tcW w:type="dxa" w:w="9026"/>
+            <w:shd w:fill="F2F4F6" w:color="auto" w:val="clear"/>
+            <w:tcMar>
+              <w:top w:type="dxa" w:w="120"/>
+              <w:left w:type="dxa" w:w="160"/>
+              <w:bottom w:type="dxa" w:w="120"/>
+              <w:right w:type="dxa" w:w="160"/>
+            </w:tcMar>
+          </w:tcPr>
+          <w:p>
+            <w:pPr>
+              <w:spacing w:after="60"/>
+            </w:pPr>
+            <w:r>
+              <w:rPr>
+                <w:rFonts w:ascii="Lato" w:cs="Lato" w:eastAsia="Lato" w:hAnsi="Lato"/>
+                <w:b/>
+                <w:bCs/>
+                <w:color w:val="009BB4"/>
+                <w:sz w:val="20"/>
+                <w:szCs w:val="20"/>
+              </w:rPr>
               <w:t xml:space="preserve">Undo an import</w:t>
             </w:r>
           </w:p>
@@ -1582,7 +1694,7 @@
         <w:rPr>
           <w:rFonts w:ascii="Lato" w:cs="Lato" w:eastAsia="Lato" w:hAnsi="Lato"/>
         </w:rPr>
-        <w:t xml:space="preserve"> box, drag or select the ACS Notification of Payment file.</w:t>
+        <w:t xml:space="preserve"> box, drag or select the ACS Notification of Payment file (upload it as ACS sends it).</w:t>
       </w:r>
     </w:p>
     <w:p>
@@ -1614,7 +1726,7 @@
         <w:rPr>
           <w:rFonts w:ascii="Lato" w:cs="Lato" w:eastAsia="Lato" w:hAnsi="Lato"/>
         </w:rPr>
-        <w:t xml:space="preserve">Matched shipments update their status automatically. If you uploaded the wrong file, use Undo (section 4).</w:t>
+        <w:t xml:space="preserve">Matched shipments update their status automatically. Re-uploading the same payment file is safe — payments already recorded are skipped.</w:t>
       </w:r>
     </w:p>
     <w:tbl>
@@ -3393,7 +3505,7 @@
         <w:rPr>
           <w:rFonts w:ascii="Lato" w:cs="Lato" w:eastAsia="Lato" w:hAnsi="Lato"/>
         </w:rPr>
-        <w:t xml:space="preserve">These are shipments where less was collected than the COD — the customer or ACS paid part of it.</w:t>
+        <w:t xml:space="preserve">Shipments where less was collected than the COD — the customer or ACS paid part of it.</w:t>
       </w:r>
     </w:p>
     <w:p>
@@ -4069,7 +4181,7 @@
                 <w:sz w:val="20"/>
                 <w:szCs w:val="20"/>
               </w:rPr>
-              <w:t xml:space="preserve">Import → File 1 (yesterday’s shipments)</w:t>
+              <w:t xml:space="preserve">Import → File 1 (this month’s file, 1st of the month to today)</w:t>
             </w:r>
           </w:p>
           <w:p>
@@ -4196,6 +4308,20 @@
                 <w:szCs w:val="20"/>
               </w:rPr>
               <w:t xml:space="preserve">Remember</w:t>
+            </w:r>
+          </w:p>
+          <w:p>
+            <w:pPr>
+              <w:spacing w:after="40"/>
+            </w:pPr>
+            <w:r>
+              <w:rPr>
+                <w:rFonts w:ascii="Lato" w:cs="Lato" w:eastAsia="Lato" w:hAnsi="Lato"/>
+                <w:color w:val="242B2E"/>
+                <w:sz w:val="20"/>
+                <w:szCs w:val="20"/>
+              </w:rPr>
+              <w:t xml:space="preserve">File 1 is month-to-date (1st → today). Re-uploading updates existing parcels and adds new ones — never duplicates.</w:t>
             </w:r>
           </w:p>
           <w:p>
@@ -4359,7 +4485,7 @@
         <w:sz w:val="16"/>
         <w:szCs w:val="16"/>
       </w:rPr>
-      <w:t xml:space="preserve">User Manual v1.1   —   Page </w:t>
+      <w:t xml:space="preserve">User Manual v1.2   —   Page </w:t>
     </w:r>
     <w:r>
       <w:rPr>

</xml_diff>